<commit_message>
Onboarding v4: one-step Customize > Plugins install, Start Here guide with Code, Chat and Design lanes
</commit_message>
<xml_diff>
--- a/onboarding/AIX-Lab-Atlas-Install-Click-by-Click.docx
+++ b/onboarding/AIX-Lab-Atlas-Install-Click-by-Click.docx
@@ -15,7 +15,7 @@
         <w:pStyle w:val="Subtitle"/>
       </w:pPr>
       <w:r>
-        <w:t xml:space="preserve">Click by click: Claude Code and Claude Design</w:t>
+        <w:t xml:space="preserve">Click by click: Claude Code, Chat and Claude Design</w:t>
       </w:r>
     </w:p>
     <w:tbl>
@@ -64,7 +64,7 @@
               <w:pStyle w:val="TableText"/>
             </w:pPr>
             <w:r>
-              <w:t xml:space="preserve">3</w:t>
+              <w:t xml:space="preserve">4</w:t>
             </w:r>
           </w:p>
         </w:tc>
@@ -95,7 +95,7 @@
               <w:pStyle w:val="TableText"/>
             </w:pPr>
             <w:r>
-              <w:t xml:space="preserve">Designers installing the skills for the first time. Pick Part A (Claude Code) or Part B (Claude Design). About 10 minutes each.</w:t>
+              <w:t xml:space="preserve">Designers installing the skills for the first time. Pick Part A (Claude Code and Chat) or Part B (Claude Design). About 10 minutes each.</w:t>
             </w:r>
           </w:p>
         </w:tc>
@@ -185,7 +185,7 @@
         </w:numPr>
       </w:pPr>
       <w:r>
-        <w:t xml:space="preserve">A Claude account on a paid plan. Claude Code needs a paid plan (or a Console account). Claude Design is on Pro, Max, Team and Enterprise; on Enterprise an admin must switch it on.</w:t>
+        <w:t xml:space="preserve">A Claude account on a paid plan (Pro, Max, Team or Enterprise). Claude Design needs a plan that includes it; on Enterprise an admin must switch it on.</w:t>
       </w:r>
     </w:p>
     <w:p>
@@ -217,7 +217,7 @@
         <w:pStyle w:val="Heading1"/>
       </w:pPr>
       <w:r>
-        <w:t xml:space="preserve">Part A. Claude Code (desktop app, Mac and Windows)</w:t>
+        <w:t xml:space="preserve">Part A. Claude Code and Chat (Mac and Windows)</w:t>
       </w:r>
     </w:p>
     <w:p>
@@ -378,7 +378,7 @@
         <w:pStyle w:val="Heading2"/>
       </w:pPr>
       <w:r>
-        <w:t xml:space="preserve">A2. Open Claude Code in a practice folder</w:t>
+        <w:t xml:space="preserve">A2. Add the skills (once per account)</w:t>
       </w:r>
     </w:p>
     <w:p>
@@ -390,6 +390,150 @@
         </w:numPr>
       </w:pPr>
       <w:r>
+        <w:t xml:space="preserve">In the Claude app, click </w:t>
+      </w:r>
+      <w:r>
+        <w:rPr>
+          <w:b/>
+        </w:rPr>
+        <w:t xml:space="preserve">Customize</w:t>
+      </w:r>
+      <w:r>
+        <w:t xml:space="preserve">, then </w:t>
+      </w:r>
+      <w:r>
+        <w:rPr>
+          <w:b/>
+        </w:rPr>
+        <w:t xml:space="preserve">Plugins</w:t>
+      </w:r>
+      <w:r>
+        <w:t xml:space="preserve">. (In a browser, open </w:t>
+      </w:r>
+      <w:hyperlink r:id="rIdL2" w:history="1">
+        <w:r>
+          <w:rPr>
+            <w:rStyle w:val="Hyperlink"/>
+          </w:rPr>
+          <w:t xml:space="preserve">claude.ai/customize/plugins</w:t>
+        </w:r>
+      </w:hyperlink>
+      <w:r>
+        <w:t xml:space="preserve">.)</w:t>
+      </w:r>
+    </w:p>
+    <w:p>
+      <w:pPr>
+        <w:pStyle w:val="ListParagraph"/>
+        <w:numPr>
+          <w:ilvl w:val="0"/>
+          <w:numId w:val="4"/>
+        </w:numPr>
+      </w:pPr>
+      <w:r>
+        <w:t xml:space="preserve">Click </w:t>
+      </w:r>
+      <w:r>
+        <w:rPr>
+          <w:b/>
+        </w:rPr>
+        <w:t xml:space="preserve">Add</w:t>
+      </w:r>
+      <w:r>
+        <w:t xml:space="preserve">, then </w:t>
+      </w:r>
+      <w:r>
+        <w:rPr>
+          <w:b/>
+        </w:rPr>
+        <w:t xml:space="preserve">Add marketplace</w:t>
+      </w:r>
+      <w:r>
+        <w:t xml:space="preserve">.</w:t>
+      </w:r>
+    </w:p>
+    <w:p>
+      <w:pPr>
+        <w:pStyle w:val="ListParagraph"/>
+        <w:numPr>
+          <w:ilvl w:val="0"/>
+          <w:numId w:val="4"/>
+        </w:numPr>
+      </w:pPr>
+      <w:r>
+        <w:t xml:space="preserve">Type </w:t>
+      </w:r>
+      <w:r>
+        <w:rPr>
+          <w:rStyle w:val="CodeChar"/>
+        </w:rPr>
+        <w:t xml:space="preserve">RPalis/AIXLab-Atlas</w:t>
+      </w:r>
+      <w:r>
+        <w:t xml:space="preserve"> and confirm.</w:t>
+      </w:r>
+    </w:p>
+    <w:p>
+      <w:pPr>
+        <w:pStyle w:val="ListParagraph"/>
+        <w:numPr>
+          <w:ilvl w:val="0"/>
+          <w:numId w:val="4"/>
+        </w:numPr>
+      </w:pPr>
+      <w:r>
+        <w:t xml:space="preserve">When the marketplace opens, find </w:t>
+      </w:r>
+      <w:r>
+        <w:rPr>
+          <w:b/>
+        </w:rPr>
+        <w:t xml:space="preserve">AIX Lab-Atlas</w:t>
+      </w:r>
+      <w:r>
+        <w:t xml:space="preserve"> and click </w:t>
+      </w:r>
+      <w:r>
+        <w:rPr>
+          <w:b/>
+        </w:rPr>
+        <w:t xml:space="preserve">Add</w:t>
+      </w:r>
+      <w:r>
+        <w:t xml:space="preserve">.</w:t>
+      </w:r>
+    </w:p>
+    <w:p>
+      <w:pPr>
+        <w:pStyle w:val="CalloutCheck"/>
+      </w:pPr>
+      <w:r>
+        <w:rPr>
+          <w:b/>
+        </w:rPr>
+        <w:t xml:space="preserve">Check: </w:t>
+      </w:r>
+      <w:r>
+        <w:t xml:space="preserve">AIX Lab-Atlas is in your plugins list. It is saved to your account, so you do not repeat this in each project, in Chat or in Claude Code.</w:t>
+      </w:r>
+    </w:p>
+    <w:p>
+      <w:pPr>
+        <w:pStyle w:val="Heading2"/>
+      </w:pPr>
+      <w:r>
+        <w:t xml:space="preserve">A3. Open Claude Code in a practice folder</w:t>
+      </w:r>
+    </w:p>
+    <w:p>
+      <w:pPr>
+        <w:pStyle w:val="ListParagraph"/>
+        <w:numPr>
+          <w:ilvl w:val="0"/>
+          <w:numId w:val="5"/>
+        </w:numPr>
+      </w:pPr>
+      <w:r>
         <w:t xml:space="preserve">Create an empty folder called </w:t>
       </w:r>
       <w:r>
@@ -443,7 +587,7 @@
         <w:pStyle w:val="ListParagraph"/>
         <w:numPr>
           <w:ilvl w:val="0"/>
-          <w:numId w:val="4"/>
+          <w:numId w:val="5"/>
         </w:numPr>
       </w:pPr>
       <w:r>
@@ -464,7 +608,7 @@
         <w:pStyle w:val="ListParagraph"/>
         <w:numPr>
           <w:ilvl w:val="0"/>
-          <w:numId w:val="4"/>
+          <w:numId w:val="5"/>
         </w:numPr>
       </w:pPr>
       <w:r>
@@ -485,7 +629,7 @@
         <w:pStyle w:val="ListParagraph"/>
         <w:numPr>
           <w:ilvl w:val="0"/>
-          <w:numId w:val="4"/>
+          <w:numId w:val="5"/>
         </w:numPr>
       </w:pPr>
       <w:r>
@@ -506,31 +650,46 @@
         <w:pStyle w:val="Heading2"/>
       </w:pPr>
       <w:r>
-        <w:t xml:space="preserve">A3. Install the skills with one line</w:t>
-      </w:r>
-    </w:p>
-    <w:p>
-      <w:pPr>
-        <w:pStyle w:val="ListParagraph"/>
-        <w:numPr>
-          <w:ilvl w:val="0"/>
-          <w:numId w:val="5"/>
-        </w:numPr>
-      </w:pPr>
-      <w:r>
-        <w:t xml:space="preserve">Click in the prompt box.</w:t>
-      </w:r>
-    </w:p>
-    <w:p>
-      <w:pPr>
-        <w:pStyle w:val="ListParagraph"/>
-        <w:numPr>
-          <w:ilvl w:val="0"/>
-          <w:numId w:val="5"/>
-        </w:numPr>
-      </w:pPr>
-      <w:r>
-        <w:t xml:space="preserve">Paste this line and press </w:t>
+        <w:t xml:space="preserve">A4. Check that it worked</w:t>
+      </w:r>
+    </w:p>
+    <w:p>
+      <w:pPr>
+        <w:pStyle w:val="ListParagraph"/>
+        <w:numPr>
+          <w:ilvl w:val="0"/>
+          <w:numId w:val="6"/>
+        </w:numPr>
+      </w:pPr>
+      <w:r>
+        <w:t xml:space="preserve">In the </w:t>
+      </w:r>
+      <w:r>
+        <w:rPr>
+          <w:b/>
+        </w:rPr>
+        <w:t xml:space="preserve">Code</w:t>
+      </w:r>
+      <w:r>
+        <w:t xml:space="preserve"> tab, start a new session. Type </w:t>
+      </w:r>
+      <w:r>
+        <w:rPr>
+          <w:rStyle w:val="CodeChar"/>
+        </w:rPr>
+        <w:t xml:space="preserve">/aix-lab-atlas:</w:t>
+      </w:r>
+      <w:r>
+        <w:t xml:space="preserve">. A list of the skills appears. If it does not, type </w:t>
+      </w:r>
+      <w:r>
+        <w:rPr>
+          <w:rStyle w:val="CodeChar"/>
+        </w:rPr>
+        <w:t xml:space="preserve">/reload-plugins</w:t>
+      </w:r>
+      <w:r>
+        <w:t xml:space="preserve"> and press </w:t>
       </w:r>
       <w:r>
         <w:rPr>
@@ -539,7 +698,232 @@
         <w:t xml:space="preserve">Enter</w:t>
       </w:r>
       <w:r>
-        <w:t xml:space="preserve">:</w:t>
+        <w:t xml:space="preserve">.</w:t>
+      </w:r>
+    </w:p>
+    <w:p>
+      <w:pPr>
+        <w:pStyle w:val="ListParagraph"/>
+        <w:numPr>
+          <w:ilvl w:val="0"/>
+          <w:numId w:val="6"/>
+        </w:numPr>
+      </w:pPr>
+      <w:r>
+        <w:t xml:space="preserve">Send </w:t>
+      </w:r>
+      <w:r>
+        <w:rPr>
+          <w:rStyle w:val="CodeChar"/>
+        </w:rPr>
+        <w:t xml:space="preserve">/aix-lab-atlas:help</w:t>
+      </w:r>
+      <w:r>
+        <w:t xml:space="preserve">. For an empty folder, Claude names </w:t>
+      </w:r>
+      <w:r>
+        <w:rPr>
+          <w:rStyle w:val="CodeChar"/>
+        </w:rPr>
+        <w:t xml:space="preserve">/aix-lab-atlas:setup</w:t>
+      </w:r>
+      <w:r>
+        <w:t xml:space="preserve"> as the first skill, and shows a plan.</w:t>
+      </w:r>
+    </w:p>
+    <w:p>
+      <w:pPr>
+        <w:pStyle w:val="ListParagraph"/>
+        <w:numPr>
+          <w:ilvl w:val="0"/>
+          <w:numId w:val="6"/>
+        </w:numPr>
+      </w:pPr>
+      <w:r>
+        <w:t xml:space="preserve">In </w:t>
+      </w:r>
+      <w:r>
+        <w:rPr>
+          <w:b/>
+        </w:rPr>
+        <w:t xml:space="preserve">Chat</w:t>
+      </w:r>
+      <w:r>
+        <w:t xml:space="preserve">, start a new chat, type </w:t>
+      </w:r>
+      <w:r>
+        <w:rPr>
+          <w:rStyle w:val="CodeChar"/>
+        </w:rPr>
+        <w:t xml:space="preserve">/</w:t>
+      </w:r>
+      <w:r>
+        <w:t xml:space="preserve"> and then </w:t>
+      </w:r>
+      <w:r>
+        <w:rPr>
+          <w:rStyle w:val="CodeChar"/>
+        </w:rPr>
+        <w:t xml:space="preserve">aix-lab-atlas</w:t>
+      </w:r>
+      <w:r>
+        <w:t xml:space="preserve">. The skills are listed.</w:t>
+      </w:r>
+    </w:p>
+    <w:p>
+      <w:pPr>
+        <w:pStyle w:val="CalloutCheck"/>
+      </w:pPr>
+      <w:r>
+        <w:rPr>
+          <w:b/>
+        </w:rPr>
+        <w:t xml:space="preserve">Check: </w:t>
+      </w:r>
+      <w:r>
+        <w:t xml:space="preserve">Typing </w:t>
+      </w:r>
+      <w:r>
+        <w:rPr>
+          <w:rStyle w:val="CodeChar"/>
+        </w:rPr>
+        <w:t xml:space="preserve">/aix-lab-atlas:</w:t>
+      </w:r>
+      <w:r>
+        <w:t xml:space="preserve"> lists skills such as </w:t>
+      </w:r>
+      <w:r>
+        <w:rPr>
+          <w:rStyle w:val="CodeChar"/>
+        </w:rPr>
+        <w:t xml:space="preserve">setup</w:t>
+      </w:r>
+      <w:r>
+        <w:t xml:space="preserve">, </w:t>
+      </w:r>
+      <w:r>
+        <w:rPr>
+          <w:rStyle w:val="CodeChar"/>
+        </w:rPr>
+        <w:t xml:space="preserve">brief</w:t>
+      </w:r>
+      <w:r>
+        <w:t xml:space="preserve">, </w:t>
+      </w:r>
+      <w:r>
+        <w:rPr>
+          <w:rStyle w:val="CodeChar"/>
+        </w:rPr>
+        <w:t xml:space="preserve">persona</w:t>
+      </w:r>
+      <w:r>
+        <w:t xml:space="preserve"> and </w:t>
+      </w:r>
+      <w:r>
+        <w:rPr>
+          <w:rStyle w:val="CodeChar"/>
+        </w:rPr>
+        <w:t xml:space="preserve">audit</w:t>
+      </w:r>
+      <w:r>
+        <w:t xml:space="preserve">. Every Claude Code command starts with </w:t>
+      </w:r>
+      <w:r>
+        <w:rPr>
+          <w:rStyle w:val="CodeChar"/>
+        </w:rPr>
+        <w:t xml:space="preserve">/aix-lab-atlas:</w:t>
+      </w:r>
+      <w:r>
+        <w:t xml:space="preserve">. To get new skill versions sooner, open </w:t>
+      </w:r>
+      <w:r>
+        <w:rPr>
+          <w:b/>
+        </w:rPr>
+        <w:t xml:space="preserve">Customize &gt; Plugins</w:t>
+      </w:r>
+      <w:r>
+        <w:t xml:space="preserve">, open the marketplace and click </w:t>
+      </w:r>
+      <w:r>
+        <w:rPr>
+          <w:b/>
+        </w:rPr>
+        <w:t xml:space="preserve">Check for updates</w:t>
+      </w:r>
+      <w:r>
+        <w:t xml:space="preserve">; turn on </w:t>
+      </w:r>
+      <w:r>
+        <w:rPr>
+          <w:b/>
+        </w:rPr>
+        <w:t xml:space="preserve">Sync automatically</w:t>
+      </w:r>
+      <w:r>
+        <w:t xml:space="preserve"> if you see it.</w:t>
+      </w:r>
+    </w:p>
+    <w:p>
+      <w:pPr>
+        <w:pStyle w:val="Heading2"/>
+      </w:pPr>
+      <w:r>
+        <w:t xml:space="preserve">A5. If Add marketplace is not available (fallback)</w:t>
+      </w:r>
+    </w:p>
+    <w:p>
+      <w:r>
+        <w:t xml:space="preserve">Use this only if A2 is not possible. Use one route only, or every skill appears twice.</w:t>
+      </w:r>
+    </w:p>
+    <w:p>
+      <w:pPr>
+        <w:pStyle w:val="ListParagraph"/>
+        <w:numPr>
+          <w:ilvl w:val="0"/>
+          <w:numId w:val="7"/>
+        </w:numPr>
+      </w:pPr>
+      <w:r>
+        <w:t xml:space="preserve">In the </w:t>
+      </w:r>
+      <w:r>
+        <w:rPr>
+          <w:b/>
+        </w:rPr>
+        <w:t xml:space="preserve">Code</w:t>
+      </w:r>
+      <w:r>
+        <w:t xml:space="preserve"> tab prompt box, paste this line and press </w:t>
+      </w:r>
+      <w:r>
+        <w:rPr>
+          <w:b/>
+        </w:rPr>
+        <w:t xml:space="preserve">Enter</w:t>
+      </w:r>
+      <w:r>
+        <w:t xml:space="preserve">. Confirm the marketplace if asked, choose </w:t>
+      </w:r>
+      <w:r>
+        <w:rPr>
+          <w:b/>
+        </w:rPr>
+        <w:t xml:space="preserve">Install for you (user scope)</w:t>
+      </w:r>
+      <w:r>
+        <w:t xml:space="preserve">, then type </w:t>
+      </w:r>
+      <w:r>
+        <w:rPr>
+          <w:rStyle w:val="CodeChar"/>
+        </w:rPr>
+        <w:t xml:space="preserve">/reload-plugins</w:t>
+      </w:r>
+      <w:r>
+        <w:t xml:space="preserve">.</w:t>
       </w:r>
     </w:p>
     <w:p>
@@ -556,281 +940,8 @@
       </w:pPr>
     </w:p>
     <w:p>
-      <w:pPr>
-        <w:pStyle w:val="ListParagraph"/>
-        <w:numPr>
-          <w:ilvl w:val="0"/>
-          <w:numId w:val="6"/>
-        </w:numPr>
-      </w:pPr>
-      <w:r>
-        <w:t xml:space="preserve">If a box asks you to add the marketplace </w:t>
-      </w:r>
-      <w:r>
-        <w:rPr>
-          <w:rStyle w:val="CodeChar"/>
-        </w:rPr>
-        <w:t xml:space="preserve">RPalis/AIXLab-Atlas</w:t>
-      </w:r>
-      <w:r>
-        <w:t xml:space="preserve">, confirm.</w:t>
-      </w:r>
-    </w:p>
-    <w:p>
-      <w:pPr>
-        <w:pStyle w:val="ListParagraph"/>
-        <w:numPr>
-          <w:ilvl w:val="0"/>
-          <w:numId w:val="6"/>
-        </w:numPr>
-      </w:pPr>
-      <w:r>
-        <w:t xml:space="preserve">When the plugin details open, choose </w:t>
-      </w:r>
-      <w:r>
-        <w:rPr>
-          <w:b/>
-        </w:rPr>
-        <w:t xml:space="preserve">Install for you (user scope)</w:t>
-      </w:r>
-      <w:r>
-        <w:t xml:space="preserve">.</w:t>
-      </w:r>
-    </w:p>
-    <w:p>
-      <w:pPr>
-        <w:pStyle w:val="ListParagraph"/>
-        <w:numPr>
-          <w:ilvl w:val="0"/>
-          <w:numId w:val="6"/>
-        </w:numPr>
-      </w:pPr>
-      <w:r>
-        <w:t xml:space="preserve">Read the summary. </w:t>
-      </w:r>
-      <w:r>
-        <w:rPr>
-          <w:rStyle w:val="CodeChar"/>
-        </w:rPr>
-        <w:t xml:space="preserve">Plugin is now active.</w:t>
-      </w:r>
-      <w:r>
-        <w:t xml:space="preserve"> means you are done. If it says </w:t>
-      </w:r>
-      <w:r>
-        <w:rPr>
-          <w:rStyle w:val="CodeChar"/>
-        </w:rPr>
-        <w:t xml:space="preserve">Run /reload-plugins to apply</w:t>
-      </w:r>
-      <w:r>
-        <w:t xml:space="preserve">, type </w:t>
-      </w:r>
-      <w:r>
-        <w:rPr>
-          <w:rStyle w:val="CodeChar"/>
-        </w:rPr>
-        <w:t xml:space="preserve">/reload-plugins</w:t>
-      </w:r>
-      <w:r>
-        <w:t xml:space="preserve"> and press </w:t>
-      </w:r>
-      <w:r>
-        <w:rPr>
-          <w:b/>
-        </w:rPr>
-        <w:t xml:space="preserve">Enter</w:t>
-      </w:r>
-      <w:r>
-        <w:t xml:space="preserve">.</w:t>
-      </w:r>
-    </w:p>
-    <w:p>
-      <w:pPr>
-        <w:pStyle w:val="Heading2"/>
-      </w:pPr>
-      <w:r>
-        <w:t xml:space="preserve">A4. Check that it worked</w:t>
-      </w:r>
-    </w:p>
-    <w:p>
-      <w:pPr>
-        <w:pStyle w:val="ListParagraph"/>
-        <w:numPr>
-          <w:ilvl w:val="0"/>
-          <w:numId w:val="7"/>
-        </w:numPr>
-      </w:pPr>
-      <w:r>
-        <w:t xml:space="preserve">In the prompt box, type </w:t>
-      </w:r>
-      <w:r>
-        <w:rPr>
-          <w:rStyle w:val="CodeChar"/>
-        </w:rPr>
-        <w:t xml:space="preserve">/aix-lab-atlas:</w:t>
-      </w:r>
-      <w:r>
-        <w:t xml:space="preserve">. A list of the skills appears.</w:t>
-      </w:r>
-    </w:p>
-    <w:p>
-      <w:pPr>
-        <w:pStyle w:val="ListParagraph"/>
-        <w:numPr>
-          <w:ilvl w:val="0"/>
-          <w:numId w:val="7"/>
-        </w:numPr>
-      </w:pPr>
-      <w:r>
-        <w:t xml:space="preserve">Send </w:t>
-      </w:r>
-      <w:r>
-        <w:rPr>
-          <w:rStyle w:val="CodeChar"/>
-        </w:rPr>
-        <w:t xml:space="preserve">/aix-lab-atlas:help</w:t>
-      </w:r>
-      <w:r>
-        <w:t xml:space="preserve">. For an empty folder, Claude names </w:t>
-      </w:r>
-      <w:r>
-        <w:rPr>
-          <w:rStyle w:val="CodeChar"/>
-        </w:rPr>
-        <w:t xml:space="preserve">/aix-lab-atlas:setup</w:t>
-      </w:r>
-      <w:r>
-        <w:t xml:space="preserve"> as the first skill, and shows a plan.</w:t>
-      </w:r>
-    </w:p>
-    <w:p>
-      <w:pPr>
-        <w:pStyle w:val="ListParagraph"/>
-        <w:numPr>
-          <w:ilvl w:val="0"/>
-          <w:numId w:val="7"/>
-        </w:numPr>
-      </w:pPr>
-      <w:r>
-        <w:t xml:space="preserve">Optional but recommended: type </w:t>
-      </w:r>
-      <w:r>
-        <w:rPr>
-          <w:rStyle w:val="CodeChar"/>
-        </w:rPr>
-        <w:t xml:space="preserve">/plugin</w:t>
-      </w:r>
-      <w:r>
-        <w:t xml:space="preserve">, open </w:t>
-      </w:r>
-      <w:r>
-        <w:rPr>
-          <w:b/>
-        </w:rPr>
-        <w:t xml:space="preserve">Marketplaces</w:t>
-      </w:r>
-      <w:r>
-        <w:t xml:space="preserve">, select </w:t>
-      </w:r>
-      <w:r>
-        <w:rPr>
-          <w:b/>
-        </w:rPr>
-        <w:t xml:space="preserve">aix-lab</w:t>
-      </w:r>
-      <w:r>
-        <w:t xml:space="preserve">, then </w:t>
-      </w:r>
-      <w:r>
-        <w:rPr>
-          <w:b/>
-        </w:rPr>
-        <w:t xml:space="preserve">Enable auto-update</w:t>
-      </w:r>
-      <w:r>
-        <w:t xml:space="preserve">. You then get every skill fix automatically.</w:t>
-      </w:r>
-    </w:p>
-    <w:p>
-      <w:pPr>
-        <w:pStyle w:val="CalloutCheck"/>
-      </w:pPr>
-      <w:r>
-        <w:rPr>
-          <w:b/>
-        </w:rPr>
-        <w:t xml:space="preserve">Check: </w:t>
-      </w:r>
-      <w:r>
-        <w:t xml:space="preserve">Typing </w:t>
-      </w:r>
-      <w:r>
-        <w:rPr>
-          <w:rStyle w:val="CodeChar"/>
-        </w:rPr>
-        <w:t xml:space="preserve">/aix-lab-atlas:</w:t>
-      </w:r>
-      <w:r>
-        <w:t xml:space="preserve"> lists skills such as </w:t>
-      </w:r>
-      <w:r>
-        <w:rPr>
-          <w:rStyle w:val="CodeChar"/>
-        </w:rPr>
-        <w:t xml:space="preserve">setup</w:t>
-      </w:r>
-      <w:r>
-        <w:t xml:space="preserve">, </w:t>
-      </w:r>
-      <w:r>
-        <w:rPr>
-          <w:rStyle w:val="CodeChar"/>
-        </w:rPr>
-        <w:t xml:space="preserve">brief</w:t>
-      </w:r>
-      <w:r>
-        <w:t xml:space="preserve">, </w:t>
-      </w:r>
-      <w:r>
-        <w:rPr>
-          <w:rStyle w:val="CodeChar"/>
-        </w:rPr>
-        <w:t xml:space="preserve">persona</w:t>
-      </w:r>
-      <w:r>
-        <w:t xml:space="preserve"> and </w:t>
-      </w:r>
-      <w:r>
-        <w:rPr>
-          <w:rStyle w:val="CodeChar"/>
-        </w:rPr>
-        <w:t xml:space="preserve">audit</w:t>
-      </w:r>
-      <w:r>
-        <w:t xml:space="preserve">. Every Claude Code command starts with </w:t>
-      </w:r>
-      <w:r>
-        <w:rPr>
-          <w:rStyle w:val="CodeChar"/>
-        </w:rPr>
-        <w:t xml:space="preserve">/aix-lab-atlas:</w:t>
-      </w:r>
-      <w:r>
-        <w:t xml:space="preserve">.</w:t>
-      </w:r>
-    </w:p>
-    <w:p>
-      <w:pPr>
-        <w:pStyle w:val="Heading2"/>
-      </w:pPr>
-      <w:r>
-        <w:t xml:space="preserve">A5. If the install line is not recognised (fallback)</w:t>
-      </w:r>
-    </w:p>
-    <w:p>
-      <w:r>
-        <w:t xml:space="preserve">Use this only if A3 fails. Never do both, or every skill appears twice.</w:t>
+      <w:r>
+        <w:t xml:space="preserve">Still not recognised? Copy the folder instead:</w:t>
       </w:r>
     </w:p>
     <w:p>
@@ -844,7 +955,7 @@
       <w:r>
         <w:t xml:space="preserve">In your browser open </w:t>
       </w:r>
-      <w:hyperlink r:id="rIdL2" w:history="1">
+      <w:hyperlink r:id="rIdL3" w:history="1">
         <w:r>
           <w:rPr>
             <w:rStyle w:val="Hyperlink"/>
@@ -1099,7 +1210,7 @@
       <w:r>
         <w:t xml:space="preserve">In your browser open </w:t>
       </w:r>
-      <w:hyperlink r:id="rIdL3" w:history="1">
+      <w:hyperlink r:id="rIdL4" w:history="1">
         <w:r>
           <w:rPr>
             <w:rStyle w:val="Hyperlink"/>
@@ -1684,7 +1795,22 @@
               <w:pStyle w:val="TableText"/>
             </w:pPr>
             <w:r>
-              <w:t xml:space="preserve">Part A: the install line is not recognised</w:t>
+              <w:t xml:space="preserve">Part A: no </w:t>
+            </w:r>
+            <w:r>
+              <w:rPr>
+                <w:b/>
+              </w:rPr>
+              <w:t xml:space="preserve">Add marketplace</w:t>
+            </w:r>
+            <w:r>
+              <w:t xml:space="preserve"> in </w:t>
+            </w:r>
+            <w:r>
+              <w:rPr>
+                <w:b/>
+              </w:rPr>
+              <w:t xml:space="preserve">Customize &gt; Plugins</w:t>
             </w:r>
           </w:p>
         </w:tc>
@@ -1737,7 +1863,7 @@
               <w:pStyle w:val="TableText"/>
             </w:pPr>
             <w:r>
-              <w:t xml:space="preserve">Type </w:t>
+              <w:t xml:space="preserve">Start a new session or type </w:t>
             </w:r>
             <w:r>
               <w:rPr>
@@ -1750,30 +1876,12 @@
             </w:r>
             <w:r>
               <w:rPr>
-                <w:rStyle w:val="CodeChar"/>
-              </w:rPr>
-              <w:t xml:space="preserve">/plugin</w:t>
-            </w:r>
-            <w:r>
-              <w:t xml:space="preserve">, </w:t>
-            </w:r>
-            <w:r>
-              <w:rPr>
                 <w:b/>
               </w:rPr>
-              <w:t xml:space="preserve">Installed</w:t>
-            </w:r>
-            <w:r>
-              <w:t xml:space="preserve">, check </w:t>
-            </w:r>
-            <w:r>
-              <w:rPr>
-                <w:b/>
-              </w:rPr>
-              <w:t xml:space="preserve">aix-lab-atlas</w:t>
-            </w:r>
-            <w:r>
-              <w:t xml:space="preserve"> is enabled.</w:t>
+              <w:t xml:space="preserve">Customize &gt; Plugins</w:t>
+            </w:r>
+            <w:r>
+              <w:t xml:space="preserve">, check AIX Lab-Atlas is on.</w:t>
             </w:r>
           </w:p>
         </w:tc>
@@ -2002,7 +2110,7 @@
         <w:color w:val="5A6B78"/>
         <w:sz w:val="16"/>
       </w:rPr>
-      <w:t>Installing the AIX Lab-Atlas skills, click by click (v3)</w:t>
+      <w:t>Installing the AIX Lab-Atlas skills, click by click (v4)</w:t>
     </w:r>
     <w:r>
       <w:rPr>

</xml_diff>